<commit_message>
feat: rename "Date changes" to "Reschedules" for clarity in admin tabs and documentation
</commit_message>
<xml_diff>
--- a/docs/qa/StoneWood-Test-Cases.docx
+++ b/docs/qa/StoneWood-Test-Cases.docx
@@ -7470,7 +7470,7 @@
                 <w:sz w:val="19"/>
                 <w:szCs w:val="19"/>
               </w:rPr>
-              <w:t xml:space="preserve">4. In the admin, open Dashboard and then the Date changes tab.</w:t>
+              <w:t xml:space="preserve">4. In the admin, open Dashboard and then the Reschedules tab.</w:t>
             </w:r>
           </w:p>
         </w:tc>
@@ -7553,7 +7553,7 @@
                 <w:sz w:val="19"/>
                 <w:szCs w:val="19"/>
               </w:rPr>
-              <w:t xml:space="preserve">• The request appears under Date changes, and the held date is not offered to anyone else.</w:t>
+              <w:t xml:space="preserve">• The request appears under Reschedules, and the held date is not offered to anyone else.</w:t>
             </w:r>
           </w:p>
         </w:tc>

</xml_diff>